<commit_message>
docs: Update group activity document and create its PDF version.
</commit_message>
<xml_diff>
--- a/03_SEMESTRE/01_HerramientasVisualizacion/Actividad_02/Entregable/ACTIVIDAD_GRUPAL_GRUPO_1C_ANALISIS_INTERACTIVOS_DE_DATOS.docx
+++ b/03_SEMESTRE/01_HerramientasVisualizacion/Actividad_02/Entregable/ACTIVIDAD_GRUPAL_GRUPO_1C_ANALISIS_INTERACTIVOS_DE_DATOS.docx
@@ -15,6 +15,7 @@
           <w:docPartUnique/>
         </w:docPartObj>
       </w:sdtPr>
+      <w:sdtEndPr/>
       <w:sdtContent>
         <w:p>
           <w:pPr>
@@ -3628,18 +3629,18 @@
             <mc:AlternateContent>
               <mc:Choice Requires="wps">
                 <w:drawing>
-                  <wp:anchor distT="0" distB="0" distL="114300" distR="114300" simplePos="0" relativeHeight="251660288" behindDoc="0" locked="0" layoutInCell="1" allowOverlap="1" wp14:anchorId="56682B44" wp14:editId="400BB667">
+                  <wp:anchor distT="0" distB="0" distL="114300" distR="114300" simplePos="0" relativeHeight="251662336" behindDoc="0" locked="0" layoutInCell="1" allowOverlap="1" wp14:anchorId="19350C47" wp14:editId="3F4C3315">
                     <wp:simplePos x="0" y="0"/>
-                    <wp:positionH relativeFrom="page">
-                      <wp:posOffset>3342005</wp:posOffset>
+                    <wp:positionH relativeFrom="column">
+                      <wp:posOffset>2409825</wp:posOffset>
                     </wp:positionH>
-                    <wp:positionV relativeFrom="page">
-                      <wp:posOffset>1669505</wp:posOffset>
+                    <wp:positionV relativeFrom="paragraph">
+                      <wp:posOffset>513080</wp:posOffset>
                     </wp:positionV>
-                    <wp:extent cx="3657600" cy="1069848"/>
-                    <wp:effectExtent l="0" t="0" r="7620" b="635"/>
+                    <wp:extent cx="3970020" cy="1478280"/>
+                    <wp:effectExtent l="0" t="0" r="17780" b="7620"/>
                     <wp:wrapNone/>
-                    <wp:docPr id="1" name="Cuadro de texto 30"/>
+                    <wp:docPr id="1851652613" name="Cuadro de texto 29"/>
                     <wp:cNvGraphicFramePr/>
                     <a:graphic xmlns:a="http://schemas.openxmlformats.org/drawingml/2006/main">
                       <a:graphicData uri="http://schemas.microsoft.com/office/word/2010/wordprocessingShape">
@@ -3648,114 +3649,95 @@
                           <wps:spPr>
                             <a:xfrm>
                               <a:off x="0" y="0"/>
-                              <a:ext cx="3657600" cy="1069848"/>
+                              <a:ext cx="3970020" cy="1478280"/>
                             </a:xfrm>
                             <a:prstGeom prst="rect">
                               <a:avLst/>
                             </a:prstGeom>
-                            <a:noFill/>
+                            <a:solidFill>
+                              <a:schemeClr val="lt1"/>
+                            </a:solidFill>
                             <a:ln w="6350">
-                              <a:noFill/>
+                              <a:solidFill>
+                                <a:prstClr val="black"/>
+                              </a:solidFill>
                             </a:ln>
-                            <a:effectLst/>
                           </wps:spPr>
-                          <wps:style>
-                            <a:lnRef idx="0">
-                              <a:schemeClr val="accent1"/>
-                            </a:lnRef>
-                            <a:fillRef idx="0">
-                              <a:schemeClr val="accent1"/>
-                            </a:fillRef>
-                            <a:effectRef idx="0">
-                              <a:schemeClr val="accent1"/>
-                            </a:effectRef>
-                            <a:fontRef idx="minor">
-                              <a:schemeClr val="dk1"/>
-                            </a:fontRef>
-                          </wps:style>
                           <wps:txbx>
                             <w:txbxContent>
                               <w:p>
                                 <w:pPr>
-                                  <w:pStyle w:val="Sinespaciado"/>
+                                  <w:pBdr>
+                                    <w:bottom w:val="single" w:sz="4" w:space="1" w:color="auto"/>
+                                  </w:pBdr>
                                   <w:rPr>
-                                    <w:color w:val="404040" w:themeColor="text1" w:themeTint="BF"/>
-                                    <w:sz w:val="36"/>
-                                    <w:szCs w:val="36"/>
+                                    <w:rFonts w:ascii="Calibri" w:hAnsi="Calibri" w:cs="Calibri"/>
+                                    <w:sz w:val="48"/>
+                                    <w:szCs w:val="48"/>
+                                    <w:lang w:val="es-ES_tradnl"/>
                                   </w:rPr>
                                 </w:pPr>
-                                <w:hyperlink r:id="rId9" w:tooltip="Actividad grupal: Dashboard interactivo de ventas con Power BI" w:history="1">
-                                  <w:r>
-                                    <w:rPr>
-                                      <w:rStyle w:val="Hipervnculo"/>
-                                      <w:rFonts w:asciiTheme="majorHAnsi" w:eastAsiaTheme="majorEastAsia" w:hAnsiTheme="majorHAnsi" w:cstheme="majorBidi"/>
-                                      <w:sz w:val="72"/>
-                                      <w:szCs w:val="72"/>
-                                      <w:u w:val="none"/>
-                                    </w:rPr>
-                                    <w:t>Actividad grupal</w:t>
-                                  </w:r>
-                                  <w:r>
-                                    <w:rPr>
-                                      <w:rStyle w:val="Hipervnculo"/>
-                                      <w:rFonts w:asciiTheme="majorHAnsi" w:eastAsiaTheme="majorEastAsia" w:hAnsiTheme="majorHAnsi" w:cstheme="majorBidi"/>
-                                      <w:sz w:val="72"/>
-                                      <w:szCs w:val="72"/>
-                                      <w:u w:val="none"/>
-                                    </w:rPr>
-                                    <w:t xml:space="preserve"> </w:t>
-                                  </w:r>
-                                  <w:r>
-                                    <w:rPr>
-                                      <w:rStyle w:val="Hipervnculo"/>
-                                      <w:rFonts w:asciiTheme="majorHAnsi" w:eastAsiaTheme="majorEastAsia" w:hAnsiTheme="majorHAnsi" w:cstheme="majorBidi"/>
-                                      <w:sz w:val="72"/>
-                                      <w:szCs w:val="72"/>
-                                      <w:u w:val="none"/>
-                                    </w:rPr>
-                                    <w:t>Dashboard interactivo de ventas con Power BI</w:t>
-                                  </w:r>
-                                </w:hyperlink>
-                                <w:sdt>
-                                  <w:sdtPr>
-                                    <w:rPr>
-                                      <w:color w:val="404040" w:themeColor="text1" w:themeTint="BF"/>
-                                      <w:sz w:val="36"/>
-                                      <w:szCs w:val="36"/>
-                                    </w:rPr>
-                                    <w:alias w:val="Subtítulo"/>
-                                    <w:tag w:val=""/>
-                                    <w:id w:val="-1148361611"/>
-                                    <w:showingPlcHdr/>
-                                    <w:dataBinding w:prefixMappings="xmlns:ns0='http://purl.org/dc/elements/1.1/' xmlns:ns1='http://schemas.openxmlformats.org/package/2006/metadata/core-properties' " w:xpath="/ns1:coreProperties[1]/ns0:subject[1]" w:storeItemID="{6C3C8BC8-F283-45AE-878A-BAB7291924A1}"/>
-                                    <w:text/>
-                                  </w:sdtPr>
-                                  <w:sdtContent>
-                                    <w:r>
-                                      <w:rPr>
-                                        <w:color w:val="404040" w:themeColor="text1" w:themeTint="BF"/>
-                                        <w:sz w:val="36"/>
-                                        <w:szCs w:val="36"/>
-                                      </w:rPr>
-                                      <w:t xml:space="preserve">     </w:t>
-                                    </w:r>
-                                  </w:sdtContent>
-                                </w:sdt>
+                                <w:r>
+                                  <w:rPr>
+                                    <w:rFonts w:ascii="Calibri" w:hAnsi="Calibri" w:cs="Calibri"/>
+                                    <w:sz w:val="48"/>
+                                    <w:szCs w:val="48"/>
+                                    <w:lang w:val="es-ES_tradnl"/>
+                                  </w:rPr>
+                                  <w:t xml:space="preserve">Actividad Grupal </w:t>
+                                </w:r>
+                                <w:proofErr w:type="spellStart"/>
+                                <w:r>
+                                  <w:rPr>
+                                    <w:rFonts w:ascii="Calibri" w:hAnsi="Calibri" w:cs="Calibri"/>
+                                    <w:sz w:val="48"/>
+                                    <w:szCs w:val="48"/>
+                                    <w:lang w:val="es-ES_tradnl"/>
+                                  </w:rPr>
+                                  <w:t>Dashboard</w:t>
+                                </w:r>
+                                <w:proofErr w:type="spellEnd"/>
+                                <w:r>
+                                  <w:rPr>
+                                    <w:rFonts w:ascii="Calibri" w:hAnsi="Calibri" w:cs="Calibri"/>
+                                    <w:sz w:val="48"/>
+                                    <w:szCs w:val="48"/>
+                                    <w:lang w:val="es-ES_tradnl"/>
+                                  </w:rPr>
+                                  <w:t xml:space="preserve"> Interactivo de Ventas con </w:t>
+                                </w:r>
+                                <w:proofErr w:type="spellStart"/>
+                                <w:r>
+                                  <w:rPr>
+                                    <w:rFonts w:ascii="Calibri" w:hAnsi="Calibri" w:cs="Calibri"/>
+                                    <w:sz w:val="48"/>
+                                    <w:szCs w:val="48"/>
+                                    <w:lang w:val="es-ES_tradnl"/>
+                                  </w:rPr>
+                                  <w:t>Power</w:t>
+                                </w:r>
+                                <w:proofErr w:type="spellEnd"/>
+                                <w:r>
+                                  <w:rPr>
+                                    <w:rFonts w:ascii="Calibri" w:hAnsi="Calibri" w:cs="Calibri"/>
+                                    <w:sz w:val="48"/>
+                                    <w:szCs w:val="48"/>
+                                    <w:lang w:val="es-ES_tradnl"/>
+                                  </w:rPr>
+                                  <w:t xml:space="preserve"> BI</w:t>
+                                </w:r>
                               </w:p>
                             </w:txbxContent>
                           </wps:txbx>
-                          <wps:bodyPr rot="0" spcFirstLastPara="0" vertOverflow="overflow" horzOverflow="overflow" vert="horz" wrap="square" lIns="0" tIns="0" rIns="0" bIns="0" numCol="1" spcCol="0" rtlCol="0" fromWordArt="0" anchor="t" anchorCtr="0" forceAA="0" compatLnSpc="1">
+                          <wps:bodyPr rot="0" spcFirstLastPara="0" vertOverflow="overflow" horzOverflow="overflow" vert="horz" wrap="square" lIns="91440" tIns="45720" rIns="91440" bIns="45720" numCol="1" spcCol="0" rtlCol="0" fromWordArt="0" anchor="t" anchorCtr="0" forceAA="0" compatLnSpc="1">
                             <a:prstTxWarp prst="textNoShape">
                               <a:avLst/>
                             </a:prstTxWarp>
-                            <a:spAutoFit/>
+                            <a:noAutofit/>
                           </wps:bodyPr>
                         </wps:wsp>
                       </a:graphicData>
                     </a:graphic>
-                    <wp14:sizeRelH relativeFrom="page">
-                      <wp14:pctWidth>45000</wp14:pctWidth>
-                    </wp14:sizeRelH>
                     <wp14:sizeRelV relativeFrom="margin">
                       <wp14:pctHeight>0</wp14:pctHeight>
                     </wp14:sizeRelV>
@@ -3764,83 +3746,77 @@
               </mc:Choice>
               <mc:Fallback>
                 <w:pict>
-                  <v:shapetype w14:anchorId="56682B44" id="_x0000_t202" coordsize="21600,21600" o:spt="202" path="m,l,21600r21600,l21600,xe">
+                  <v:shapetype w14:anchorId="19350C47" id="_x0000_t202" coordsize="21600,21600" o:spt="202" path="m,l,21600r21600,l21600,xe">
                     <v:stroke joinstyle="miter"/>
                     <v:path gradientshapeok="t" o:connecttype="rect"/>
                   </v:shapetype>
-                  <v:shape id="Cuadro de texto 30" o:spid="_x0000_s1055" type="#_x0000_t202" style="position:absolute;left:0;text-align:left;margin-left:263.15pt;margin-top:131.45pt;width:4in;height:84.25pt;z-index:251660288;visibility:visible;mso-wrap-style:square;mso-width-percent:450;mso-height-percent:0;mso-wrap-distance-left:9pt;mso-wrap-distance-top:0;mso-wrap-distance-right:9pt;mso-wrap-distance-bottom:0;mso-position-horizontal:absolute;mso-position-horizontal-relative:page;mso-position-vertical:absolute;mso-position-vertical-relative:page;mso-width-percent:450;mso-height-percent:0;mso-width-relative:page;mso-height-relative:margin;v-text-anchor:top" o:gfxdata="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" filled="f" stroked="f" strokeweight=".5pt">
-                    <v:textbox style="mso-fit-shape-to-text:t" inset="0,0,0,0">
+                  <v:shape id="Cuadro de texto 29" o:spid="_x0000_s1055" type="#_x0000_t202" style="position:absolute;left:0;text-align:left;margin-left:189.75pt;margin-top:40.4pt;width:312.6pt;height:116.4pt;z-index:251662336;visibility:visible;mso-wrap-style:square;mso-height-percent:0;mso-wrap-distance-left:9pt;mso-wrap-distance-top:0;mso-wrap-distance-right:9pt;mso-wrap-distance-bottom:0;mso-position-horizontal:absolute;mso-position-horizontal-relative:text;mso-position-vertical:absolute;mso-position-vertical-relative:text;mso-height-percent:0;mso-height-relative:margin;v-text-anchor:top" o:gfxdata="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" fillcolor="white [3201]" strokeweight=".5pt">
+                    <v:textbox>
                       <w:txbxContent>
                         <w:p>
                           <w:pPr>
-                            <w:pStyle w:val="Sinespaciado"/>
+                            <w:pBdr>
+                              <w:bottom w:val="single" w:sz="4" w:space="1" w:color="auto"/>
+                            </w:pBdr>
                             <w:rPr>
-                              <w:color w:val="404040" w:themeColor="text1" w:themeTint="BF"/>
-                              <w:sz w:val="36"/>
-                              <w:szCs w:val="36"/>
+                              <w:rFonts w:ascii="Calibri" w:hAnsi="Calibri" w:cs="Calibri"/>
+                              <w:sz w:val="48"/>
+                              <w:szCs w:val="48"/>
+                              <w:lang w:val="es-ES_tradnl"/>
                             </w:rPr>
                           </w:pPr>
-                          <w:hyperlink r:id="rId10" w:tooltip="Actividad grupal: Dashboard interactivo de ventas con Power BI" w:history="1">
-                            <w:r>
-                              <w:rPr>
-                                <w:rStyle w:val="Hipervnculo"/>
-                                <w:rFonts w:asciiTheme="majorHAnsi" w:eastAsiaTheme="majorEastAsia" w:hAnsiTheme="majorHAnsi" w:cstheme="majorBidi"/>
-                                <w:sz w:val="72"/>
-                                <w:szCs w:val="72"/>
-                                <w:u w:val="none"/>
-                              </w:rPr>
-                              <w:t>Actividad grupal</w:t>
-                            </w:r>
-                            <w:r>
-                              <w:rPr>
-                                <w:rStyle w:val="Hipervnculo"/>
-                                <w:rFonts w:asciiTheme="majorHAnsi" w:eastAsiaTheme="majorEastAsia" w:hAnsiTheme="majorHAnsi" w:cstheme="majorBidi"/>
-                                <w:sz w:val="72"/>
-                                <w:szCs w:val="72"/>
-                                <w:u w:val="none"/>
-                              </w:rPr>
-                              <w:t xml:space="preserve"> </w:t>
-                            </w:r>
-                            <w:r>
-                              <w:rPr>
-                                <w:rStyle w:val="Hipervnculo"/>
-                                <w:rFonts w:asciiTheme="majorHAnsi" w:eastAsiaTheme="majorEastAsia" w:hAnsiTheme="majorHAnsi" w:cstheme="majorBidi"/>
-                                <w:sz w:val="72"/>
-                                <w:szCs w:val="72"/>
-                                <w:u w:val="none"/>
-                              </w:rPr>
-                              <w:t>Dashboard interactivo de ventas con Power BI</w:t>
-                            </w:r>
-                          </w:hyperlink>
-                          <w:sdt>
-                            <w:sdtPr>
-                              <w:rPr>
-                                <w:color w:val="404040" w:themeColor="text1" w:themeTint="BF"/>
-                                <w:sz w:val="36"/>
-                                <w:szCs w:val="36"/>
-                              </w:rPr>
-                              <w:alias w:val="Subtítulo"/>
-                              <w:tag w:val=""/>
-                              <w:id w:val="-1148361611"/>
-                              <w:showingPlcHdr/>
-                              <w:dataBinding w:prefixMappings="xmlns:ns0='http://purl.org/dc/elements/1.1/' xmlns:ns1='http://schemas.openxmlformats.org/package/2006/metadata/core-properties' " w:xpath="/ns1:coreProperties[1]/ns0:subject[1]" w:storeItemID="{6C3C8BC8-F283-45AE-878A-BAB7291924A1}"/>
-                              <w:text/>
-                            </w:sdtPr>
-                            <w:sdtContent>
-                              <w:r>
-                                <w:rPr>
-                                  <w:color w:val="404040" w:themeColor="text1" w:themeTint="BF"/>
-                                  <w:sz w:val="36"/>
-                                  <w:szCs w:val="36"/>
-                                </w:rPr>
-                                <w:t xml:space="preserve">     </w:t>
-                              </w:r>
-                            </w:sdtContent>
-                          </w:sdt>
+                          <w:r>
+                            <w:rPr>
+                              <w:rFonts w:ascii="Calibri" w:hAnsi="Calibri" w:cs="Calibri"/>
+                              <w:sz w:val="48"/>
+                              <w:szCs w:val="48"/>
+                              <w:lang w:val="es-ES_tradnl"/>
+                            </w:rPr>
+                            <w:t xml:space="preserve">Actividad Grupal </w:t>
+                          </w:r>
+                          <w:proofErr w:type="spellStart"/>
+                          <w:r>
+                            <w:rPr>
+                              <w:rFonts w:ascii="Calibri" w:hAnsi="Calibri" w:cs="Calibri"/>
+                              <w:sz w:val="48"/>
+                              <w:szCs w:val="48"/>
+                              <w:lang w:val="es-ES_tradnl"/>
+                            </w:rPr>
+                            <w:t>Dashboard</w:t>
+                          </w:r>
+                          <w:proofErr w:type="spellEnd"/>
+                          <w:r>
+                            <w:rPr>
+                              <w:rFonts w:ascii="Calibri" w:hAnsi="Calibri" w:cs="Calibri"/>
+                              <w:sz w:val="48"/>
+                              <w:szCs w:val="48"/>
+                              <w:lang w:val="es-ES_tradnl"/>
+                            </w:rPr>
+                            <w:t xml:space="preserve"> Interactivo de Ventas con </w:t>
+                          </w:r>
+                          <w:proofErr w:type="spellStart"/>
+                          <w:r>
+                            <w:rPr>
+                              <w:rFonts w:ascii="Calibri" w:hAnsi="Calibri" w:cs="Calibri"/>
+                              <w:sz w:val="48"/>
+                              <w:szCs w:val="48"/>
+                              <w:lang w:val="es-ES_tradnl"/>
+                            </w:rPr>
+                            <w:t>Power</w:t>
+                          </w:r>
+                          <w:proofErr w:type="spellEnd"/>
+                          <w:r>
+                            <w:rPr>
+                              <w:rFonts w:ascii="Calibri" w:hAnsi="Calibri" w:cs="Calibri"/>
+                              <w:sz w:val="48"/>
+                              <w:szCs w:val="48"/>
+                              <w:lang w:val="es-ES_tradnl"/>
+                            </w:rPr>
+                            <w:t xml:space="preserve"> BI</w:t>
+                          </w:r>
                         </w:p>
                       </w:txbxContent>
                     </v:textbox>
-                    <w10:wrap anchorx="page" anchory="page"/>
                   </v:shape>
                 </w:pict>
               </mc:Fallback>
@@ -3856,7 +3832,7 @@
             <mc:AlternateContent>
               <mc:Choice Requires="wps">
                 <w:drawing>
-                  <wp:anchor distT="0" distB="0" distL="114300" distR="114300" simplePos="0" relativeHeight="251661312" behindDoc="0" locked="0" layoutInCell="1" allowOverlap="1" wp14:anchorId="07624A83" wp14:editId="3175FFF6">
+                  <wp:anchor distT="0" distB="0" distL="114300" distR="114300" simplePos="0" relativeHeight="251661312" behindDoc="0" locked="0" layoutInCell="1" allowOverlap="1" wp14:anchorId="07624A83" wp14:editId="461B259A">
                     <wp:simplePos x="0" y="0"/>
                     <wp:positionH relativeFrom="page">
                       <wp:posOffset>3094882</wp:posOffset>
@@ -4074,6 +4050,15 @@
             </w:rPr>
             <w:br w:type="page"/>
           </w:r>
+          <w:r>
+            <w:rPr>
+              <w:rFonts w:ascii="Calibri" w:hAnsi="Calibri" w:cs="Calibri"/>
+              <w:sz w:val="24"/>
+              <w:szCs w:val="24"/>
+            </w:rPr>
+            <w:lastRenderedPageBreak/>
+            <w:t xml:space="preserve"> </w:t>
+          </w:r>
         </w:p>
       </w:sdtContent>
     </w:sdt>
@@ -4194,7 +4179,7 @@
                 <w:noProof/>
                 <w:webHidden/>
               </w:rPr>
-              <w:t>1</w:t>
+              <w:t>2</w:t>
             </w:r>
             <w:r>
               <w:rPr>
@@ -4270,7 +4255,7 @@
                 <w:noProof/>
                 <w:webHidden/>
               </w:rPr>
-              <w:t>2</w:t>
+              <w:t>3</w:t>
             </w:r>
             <w:r>
               <w:rPr>
@@ -4726,7 +4711,6 @@
           <w:sz w:val="24"/>
           <w:szCs w:val="24"/>
         </w:rPr>
-        <w:lastRenderedPageBreak/>
         <w:t>Introducción</w:t>
       </w:r>
       <w:bookmarkEnd w:id="0"/>
@@ -5574,7 +5558,7 @@
                     <pic:cNvPicPr/>
                   </pic:nvPicPr>
                   <pic:blipFill>
-                    <a:blip r:embed="rId11"/>
+                    <a:blip r:embed="rId9"/>
                     <a:stretch>
                       <a:fillRect/>
                     </a:stretch>
@@ -5824,7 +5808,7 @@
                     <pic:cNvPicPr/>
                   </pic:nvPicPr>
                   <pic:blipFill>
-                    <a:blip r:embed="rId12"/>
+                    <a:blip r:embed="rId10"/>
                     <a:stretch>
                       <a:fillRect/>
                     </a:stretch>
@@ -5954,7 +5938,7 @@
                     <pic:cNvPicPr/>
                   </pic:nvPicPr>
                   <pic:blipFill>
-                    <a:blip r:embed="rId13" cstate="print">
+                    <a:blip r:embed="rId11" cstate="print">
                       <a:extLst>
                         <a:ext uri="{28A0092B-C50C-407E-A947-70E740481C1C}">
                           <a14:useLocalDpi xmlns:a14="http://schemas.microsoft.com/office/drawing/2010/main" val="0"/>
@@ -6009,6 +5993,20 @@
         <w:t xml:space="preserve"> Interactivo</w:t>
       </w:r>
       <w:r>
+        <w:t xml:space="preserve"> – Descargar </w:t>
+      </w:r>
+      <w:hyperlink r:id="rId12" w:history="1">
+        <w:r>
+          <w:rPr>
+            <w:rStyle w:val="Hipervnculo"/>
+          </w:rPr>
+          <w:t>Aqui</w:t>
+        </w:r>
+      </w:hyperlink>
+      <w:r>
+        <w:t xml:space="preserve"> </w:t>
+      </w:r>
+      <w:r>
         <w:t>]</w:t>
       </w:r>
     </w:p>
@@ -6305,8 +6303,8 @@
       </w:pPr>
     </w:p>
     <w:sectPr>
-      <w:headerReference w:type="default" r:id="rId14"/>
-      <w:footerReference w:type="default" r:id="rId15"/>
+      <w:headerReference w:type="default" r:id="rId13"/>
+      <w:footerReference w:type="default" r:id="rId14"/>
       <w:pgSz w:w="12240" w:h="15840"/>
       <w:pgMar w:top="1417" w:right="1325" w:bottom="1417" w:left="993" w:header="708" w:footer="708" w:gutter="0"/>
       <w:pgNumType w:start="0"/>
@@ -9175,6 +9173,18 @@
       <w:ind w:left="1600"/>
     </w:pPr>
   </w:style>
+  <w:style w:type="character" w:styleId="Hipervnculovisitado">
+    <w:name w:val="FollowedHyperlink"/>
+    <w:basedOn w:val="Fuentedeprrafopredeter"/>
+    <w:uiPriority w:val="99"/>
+    <w:semiHidden/>
+    <w:unhideWhenUsed/>
+    <w:rsid w:val="00501D26"/>
+    <w:rPr>
+      <w:color w:val="96607D" w:themeColor="followedHyperlink"/>
+      <w:u w:val="single"/>
+    </w:rPr>
+  </w:style>
 </w:styles>
 </file>
 

</xml_diff>